<commit_message>
small edits to update
</commit_message>
<xml_diff>
--- a/assets/downloadable/Luong_Catherine_Resume.docx
+++ b/assets/downloadable/Luong_Catherine_Resume.docx
@@ -1,6 +1,6 @@
 
 <file path=word/document.xml><?xml version="1.0" encoding="utf-8"?>
-<w:document xmlns:wpc="http://schemas.microsoft.com/office/word/2010/wordprocessingCanvas" xmlns:cx="http://schemas.microsoft.com/office/drawing/2014/chartex" xmlns:cx1="http://schemas.microsoft.com/office/drawing/2015/9/8/chartex" xmlns:cx2="http://schemas.microsoft.com/office/drawing/2015/10/21/chartex" xmlns:cx3="http://schemas.microsoft.com/office/drawing/2016/5/9/chartex" xmlns:cx4="http://schemas.microsoft.com/office/drawing/2016/5/10/chartex" xmlns:cx5="http://schemas.microsoft.com/office/drawing/2016/5/11/chartex" xmlns:cx6="http://schemas.microsoft.com/office/drawing/2016/5/12/chartex" xmlns:cx7="http://schemas.microsoft.com/office/drawing/2016/5/13/chartex" xmlns:cx8="http://schemas.microsoft.com/office/drawing/2016/5/14/chartex" xmlns:mc="http://schemas.openxmlformats.org/markup-compatibility/2006" xmlns:aink="http://schemas.microsoft.com/office/drawing/2016/ink" xmlns:am3d="http://schemas.microsoft.com/office/drawing/2017/model3d" xmlns:o="urn:schemas-microsoft-com:office:office" xmlns:oel="http://schemas.microsoft.com/office/2019/extlst" xmlns:r="http://schemas.openxmlformats.org/officeDocument/2006/relationships" xmlns:m="http://schemas.openxmlformats.org/officeDocument/2006/math" xmlns:v="urn:schemas-microsoft-com:vml" xmlns:wp14="http://schemas.microsoft.com/office/word/2010/wordprocessingDrawing" xmlns:wp="http://schemas.openxmlformats.org/drawingml/2006/wordprocessingDrawing" xmlns:w10="urn:schemas-microsoft-com:office:word" xmlns:w="http://schemas.openxmlformats.org/wordprocessingml/2006/main" xmlns:w14="http://schemas.microsoft.com/office/word/2010/wordml" xmlns:w15="http://schemas.microsoft.com/office/word/2012/wordml" xmlns:w16cex="http://schemas.microsoft.com/office/word/2018/wordml/cex" xmlns:w16cid="http://schemas.microsoft.com/office/word/2016/wordml/cid" xmlns:w16="http://schemas.microsoft.com/office/word/2018/wordml" xmlns:w16sdtdh="http://schemas.microsoft.com/office/word/2020/wordml/sdtdatahash" xmlns:w16se="http://schemas.microsoft.com/office/word/2015/wordml/symex" xmlns:wpg="http://schemas.microsoft.com/office/word/2010/wordprocessingGroup" xmlns:wpi="http://schemas.microsoft.com/office/word/2010/wordprocessingInk" xmlns:wne="http://schemas.microsoft.com/office/word/2006/wordml" xmlns:wps="http://schemas.microsoft.com/office/word/2010/wordprocessingShape" mc:Ignorable="w14 w15 w16se w16cid w16 w16cex w16sdtdh wp14">
+<w:document xmlns:wpc="http://schemas.microsoft.com/office/word/2010/wordprocessingCanvas" xmlns:cx="http://schemas.microsoft.com/office/drawing/2014/chartex" xmlns:cx1="http://schemas.microsoft.com/office/drawing/2015/9/8/chartex" xmlns:cx2="http://schemas.microsoft.com/office/drawing/2015/10/21/chartex" xmlns:cx3="http://schemas.microsoft.com/office/drawing/2016/5/9/chartex" xmlns:cx4="http://schemas.microsoft.com/office/drawing/2016/5/10/chartex" xmlns:cx5="http://schemas.microsoft.com/office/drawing/2016/5/11/chartex" xmlns:cx6="http://schemas.microsoft.com/office/drawing/2016/5/12/chartex" xmlns:cx7="http://schemas.microsoft.com/office/drawing/2016/5/13/chartex" xmlns:cx8="http://schemas.microsoft.com/office/drawing/2016/5/14/chartex" xmlns:mc="http://schemas.openxmlformats.org/markup-compatibility/2006" xmlns:aink="http://schemas.microsoft.com/office/drawing/2016/ink" xmlns:am3d="http://schemas.microsoft.com/office/drawing/2017/model3d" xmlns:o="urn:schemas-microsoft-com:office:office" xmlns:oel="http://schemas.microsoft.com/office/2019/extlst" xmlns:r="http://schemas.openxmlformats.org/officeDocument/2006/relationships" xmlns:m="http://schemas.openxmlformats.org/officeDocument/2006/math" xmlns:v="urn:schemas-microsoft-com:vml" xmlns:wp14="http://schemas.microsoft.com/office/word/2010/wordprocessingDrawing" xmlns:wp="http://schemas.openxmlformats.org/drawingml/2006/wordprocessingDrawing" xmlns:w10="urn:schemas-microsoft-com:office:word" xmlns:w="http://schemas.openxmlformats.org/wordprocessingml/2006/main" xmlns:w14="http://schemas.microsoft.com/office/word/2010/wordml" xmlns:w15="http://schemas.microsoft.com/office/word/2012/wordml" xmlns:w16cex="http://schemas.microsoft.com/office/word/2018/wordml/cex" xmlns:w16cid="http://schemas.microsoft.com/office/word/2016/wordml/cid" xmlns:w16="http://schemas.microsoft.com/office/word/2018/wordml" xmlns:w16du="http://schemas.microsoft.com/office/word/2023/wordml/word16du" xmlns:w16sdtdh="http://schemas.microsoft.com/office/word/2020/wordml/sdtdatahash" xmlns:w16sdtfl="http://schemas.microsoft.com/office/word/2024/wordml/sdtformatlock" xmlns:w16se="http://schemas.microsoft.com/office/word/2015/wordml/symex" xmlns:wpg="http://schemas.microsoft.com/office/word/2010/wordprocessingGroup" xmlns:wpi="http://schemas.microsoft.com/office/word/2010/wordprocessingInk" xmlns:wne="http://schemas.microsoft.com/office/word/2006/wordml" xmlns:wps="http://schemas.microsoft.com/office/word/2010/wordprocessingShape" mc:Ignorable="w14 w15 w16se w16cid w16 w16cex w16sdtdh w16sdtfl w16du wp14">
   <w:body>
     <w:p>
       <w:pPr>
@@ -101,10 +101,7 @@
         <w:t>|</w:t>
       </w:r>
       <w:r>
-        <w:t xml:space="preserve"> </w:t>
-      </w:r>
-      <w:r>
-        <w:t>catherine.b.luong@gmail.com</w:t>
+        <w:t xml:space="preserve"> catherine.b.luong@gmail.com</w:t>
       </w:r>
       <w:r>
         <w:t xml:space="preserve"> |</w:t>
@@ -115,35 +112,7 @@
             <w:color w:val="0462C1"/>
             <w:u w:val="thick" w:color="0462C1"/>
           </w:rPr>
-          <w:t>Li</w:t>
-        </w:r>
-        <w:r>
-          <w:rPr>
-            <w:color w:val="0462C1"/>
-            <w:u w:val="thick" w:color="0462C1"/>
-          </w:rPr>
-          <w:t>n</w:t>
-        </w:r>
-        <w:r>
-          <w:rPr>
-            <w:color w:val="0462C1"/>
-            <w:u w:val="thick" w:color="0462C1"/>
-          </w:rPr>
-          <w:t>k</w:t>
-        </w:r>
-        <w:r>
-          <w:rPr>
-            <w:color w:val="0462C1"/>
-            <w:u w:val="thick" w:color="0462C1"/>
-          </w:rPr>
-          <w:t>e</w:t>
-        </w:r>
-        <w:r>
-          <w:rPr>
-            <w:color w:val="0462C1"/>
-            <w:u w:val="thick" w:color="0462C1"/>
-          </w:rPr>
-          <w:t>dIn</w:t>
+          <w:t>LinkedIn</w:t>
         </w:r>
       </w:hyperlink>
       <w:r>
@@ -153,38 +122,6 @@
         </w:rPr>
         <w:t xml:space="preserve"> </w:t>
       </w:r>
-      <w:r>
-        <w:t>|</w:t>
-      </w:r>
-      <w:r>
-        <w:rPr>
-          <w:spacing w:val="-4"/>
-        </w:rPr>
-        <w:t xml:space="preserve"> </w:t>
-      </w:r>
-      <w:hyperlink r:id="rId6">
-        <w:r>
-          <w:rPr>
-            <w:color w:val="0462C1"/>
-            <w:u w:val="thick" w:color="0462C1"/>
-          </w:rPr>
-          <w:t>Portf</w:t>
-        </w:r>
-        <w:r>
-          <w:rPr>
-            <w:color w:val="0462C1"/>
-            <w:u w:val="thick" w:color="0462C1"/>
-          </w:rPr>
-          <w:t>o</w:t>
-        </w:r>
-        <w:r>
-          <w:rPr>
-            <w:color w:val="0462C1"/>
-            <w:u w:val="thick" w:color="0462C1"/>
-          </w:rPr>
-          <w:t>lio</w:t>
-        </w:r>
-      </w:hyperlink>
     </w:p>
     <w:p>
       <w:pPr>
@@ -238,6 +175,159 @@
       <w:pPr>
         <w:pStyle w:val="BodyText"/>
         <w:tabs>
+          <w:tab w:val="right" w:pos="9180"/>
+        </w:tabs>
+        <w:ind w:left="0" w:firstLine="0"/>
+        <w:contextualSpacing/>
+        <w:rPr>
+          <w:sz w:val="22"/>
+          <w:szCs w:val="22"/>
+        </w:rPr>
+      </w:pPr>
+      <w:r>
+        <w:rPr>
+          <w:b/>
+          <w:sz w:val="22"/>
+          <w:szCs w:val="22"/>
+        </w:rPr>
+        <w:t>B.A.,</w:t>
+      </w:r>
+      <w:r>
+        <w:rPr>
+          <w:b/>
+          <w:spacing w:val="-5"/>
+          <w:sz w:val="22"/>
+          <w:szCs w:val="22"/>
+        </w:rPr>
+        <w:t xml:space="preserve"> </w:t>
+      </w:r>
+      <w:r>
+        <w:rPr>
+          <w:b/>
+          <w:sz w:val="22"/>
+          <w:szCs w:val="22"/>
+        </w:rPr>
+        <w:t>Graphic Design</w:t>
+      </w:r>
+      <w:r>
+        <w:rPr>
+          <w:b/>
+          <w:spacing w:val="-5"/>
+        </w:rPr>
+        <w:t xml:space="preserve">, </w:t>
+      </w:r>
+      <w:r>
+        <w:rPr>
+          <w:sz w:val="22"/>
+          <w:szCs w:val="22"/>
+        </w:rPr>
+        <w:t>San</w:t>
+      </w:r>
+      <w:r>
+        <w:rPr>
+          <w:spacing w:val="-10"/>
+          <w:sz w:val="22"/>
+          <w:szCs w:val="22"/>
+        </w:rPr>
+        <w:t xml:space="preserve"> </w:t>
+      </w:r>
+      <w:r>
+        <w:rPr>
+          <w:sz w:val="22"/>
+          <w:szCs w:val="22"/>
+        </w:rPr>
+        <w:t>Francisco</w:t>
+      </w:r>
+      <w:r>
+        <w:rPr>
+          <w:spacing w:val="-10"/>
+          <w:sz w:val="22"/>
+          <w:szCs w:val="22"/>
+        </w:rPr>
+        <w:t xml:space="preserve"> </w:t>
+      </w:r>
+      <w:r>
+        <w:rPr>
+          <w:sz w:val="22"/>
+          <w:szCs w:val="22"/>
+        </w:rPr>
+        <w:t>State</w:t>
+      </w:r>
+      <w:r>
+        <w:rPr>
+          <w:spacing w:val="-10"/>
+          <w:sz w:val="22"/>
+          <w:szCs w:val="22"/>
+        </w:rPr>
+        <w:t xml:space="preserve"> </w:t>
+      </w:r>
+      <w:r>
+        <w:rPr>
+          <w:sz w:val="22"/>
+          <w:szCs w:val="22"/>
+        </w:rPr>
+        <w:t>University,</w:t>
+      </w:r>
+      <w:r>
+        <w:rPr>
+          <w:spacing w:val="-10"/>
+          <w:sz w:val="22"/>
+          <w:szCs w:val="22"/>
+        </w:rPr>
+        <w:t xml:space="preserve"> </w:t>
+      </w:r>
+      <w:r>
+        <w:rPr>
+          <w:sz w:val="22"/>
+          <w:szCs w:val="22"/>
+        </w:rPr>
+        <w:t>San</w:t>
+      </w:r>
+      <w:r>
+        <w:rPr>
+          <w:spacing w:val="-9"/>
+          <w:sz w:val="22"/>
+          <w:szCs w:val="22"/>
+        </w:rPr>
+        <w:t xml:space="preserve"> </w:t>
+      </w:r>
+      <w:r>
+        <w:rPr>
+          <w:spacing w:val="-4"/>
+          <w:sz w:val="22"/>
+          <w:szCs w:val="22"/>
+        </w:rPr>
+        <w:t>Jose</w:t>
+      </w:r>
+      <w:r>
+        <w:rPr>
+          <w:spacing w:val="-4"/>
+          <w:sz w:val="22"/>
+          <w:szCs w:val="22"/>
+        </w:rPr>
+        <w:t>, CA</w:t>
+      </w:r>
+      <w:r>
+        <w:rPr>
+          <w:spacing w:val="-4"/>
+          <w:sz w:val="22"/>
+          <w:szCs w:val="22"/>
+        </w:rPr>
+        <w:t xml:space="preserve">                                                                            </w:t>
+      </w:r>
+      <w:r>
+        <w:rPr>
+          <w:spacing w:val="-4"/>
+          <w:sz w:val="22"/>
+          <w:szCs w:val="22"/>
+        </w:rPr>
+        <w:t>Jan 2025 - Present</w:t>
+      </w:r>
+    </w:p>
+    <w:p>
+      <w:pPr>
+        <w:pStyle w:val="BodyText"/>
+        <w:tabs>
           <w:tab w:val="right" w:pos="10800"/>
         </w:tabs>
         <w:ind w:left="0" w:firstLine="0"/>
@@ -296,63 +386,12 @@
           <w:sz w:val="22"/>
           <w:szCs w:val="22"/>
         </w:rPr>
-        <w:t xml:space="preserve"> </w:t>
-      </w:r>
-      <w:r>
-        <w:rPr>
-          <w:b/>
-          <w:sz w:val="22"/>
-          <w:szCs w:val="22"/>
-        </w:rPr>
-        <w:t>Art,</w:t>
+        <w:t xml:space="preserve"> Art</w:t>
       </w:r>
       <w:r>
         <w:rPr>
           <w:b/>
           <w:spacing w:val="-5"/>
-          <w:sz w:val="22"/>
-          <w:szCs w:val="22"/>
-        </w:rPr>
-        <w:t xml:space="preserve"> </w:t>
-      </w:r>
-      <w:r>
-        <w:rPr>
-          <w:b/>
-          <w:sz w:val="22"/>
-          <w:szCs w:val="22"/>
-        </w:rPr>
-        <w:t>Digital</w:t>
-      </w:r>
-      <w:r>
-        <w:rPr>
-          <w:b/>
-          <w:spacing w:val="-5"/>
-          <w:sz w:val="22"/>
-          <w:szCs w:val="22"/>
-        </w:rPr>
-        <w:t xml:space="preserve"> </w:t>
-      </w:r>
-      <w:r>
-        <w:rPr>
-          <w:b/>
-          <w:sz w:val="22"/>
-          <w:szCs w:val="22"/>
-        </w:rPr>
-        <w:t>Media</w:t>
-      </w:r>
-      <w:r>
-        <w:rPr>
-          <w:b/>
-          <w:spacing w:val="-5"/>
-          <w:sz w:val="22"/>
-          <w:szCs w:val="22"/>
-        </w:rPr>
-        <w:t xml:space="preserve"> Art</w:t>
-      </w:r>
-      <w:r>
-        <w:rPr>
-          <w:b/>
-          <w:spacing w:val="-5"/>
         </w:rPr>
         <w:t xml:space="preserve">, </w:t>
       </w:r>
@@ -455,6 +494,50 @@
         </w:rPr>
         <w:tab/>
         <w:t>Dec 2023</w:t>
+      </w:r>
+    </w:p>
+    <w:p>
+      <w:pPr>
+        <w:pStyle w:val="BodyText"/>
+        <w:tabs>
+          <w:tab w:val="right" w:pos="9180"/>
+        </w:tabs>
+        <w:ind w:left="0" w:firstLine="0"/>
+        <w:contextualSpacing/>
+        <w:rPr>
+          <w:sz w:val="22"/>
+          <w:szCs w:val="22"/>
+        </w:rPr>
+      </w:pPr>
+    </w:p>
+    <w:p>
+      <w:pPr>
+        <w:pStyle w:val="Heading1"/>
+        <w:tabs>
+          <w:tab w:val="right" w:pos="9180"/>
+        </w:tabs>
+        <w:ind w:left="0"/>
+        <w:contextualSpacing/>
+        <w:rPr>
+          <w:sz w:val="22"/>
+          <w:szCs w:val="22"/>
+        </w:rPr>
+      </w:pPr>
+      <w:r>
+        <w:rPr>
+          <w:spacing w:val="-2"/>
+          <w:sz w:val="22"/>
+          <w:szCs w:val="22"/>
+        </w:rPr>
+        <w:t xml:space="preserve">TECHNICAL </w:t>
+      </w:r>
+      <w:r>
+        <w:rPr>
+          <w:spacing w:val="-2"/>
+          <w:sz w:val="22"/>
+          <w:szCs w:val="22"/>
+        </w:rPr>
+        <w:t>SKILLS</w:t>
       </w:r>
     </w:p>
     <w:p>
@@ -464,154 +547,81 @@
           <w:ilvl w:val="0"/>
           <w:numId w:val="7"/>
         </w:numPr>
-        <w:tabs>
-          <w:tab w:val="right" w:pos="10800"/>
-        </w:tabs>
         <w:contextualSpacing/>
       </w:pPr>
       <w:r>
         <w:rPr>
           <w:b/>
+        </w:rPr>
+        <w:t>Programming:</w:t>
+      </w:r>
+      <w:r>
+        <w:t xml:space="preserve"> Proficient in</w:t>
+      </w:r>
+      <w:r>
+        <w:rPr>
+          <w:spacing w:val="-4"/>
+        </w:rPr>
+        <w:t xml:space="preserve"> </w:t>
+      </w:r>
+      <w:r>
+        <w:t>HTML/CSS/JavaScript</w:t>
+      </w:r>
+    </w:p>
+    <w:p>
+      <w:pPr>
+        <w:pStyle w:val="ListParagraph"/>
+        <w:numPr>
+          <w:ilvl w:val="0"/>
+          <w:numId w:val="7"/>
+        </w:numPr>
+        <w:contextualSpacing/>
+      </w:pPr>
+      <w:r>
+        <w:rPr>
+          <w:b/>
+        </w:rPr>
+        <w:t>Design Software:</w:t>
+      </w:r>
+      <w:r>
+        <w:t xml:space="preserve"> Proficient in</w:t>
+      </w:r>
+      <w:r>
+        <w:rPr>
+          <w:spacing w:val="-7"/>
+        </w:rPr>
+        <w:t xml:space="preserve"> </w:t>
+      </w:r>
+      <w:r>
+        <w:t>Adobe After Effects/Illustrator/Photoshop/</w:t>
+      </w:r>
+      <w:r>
+        <w:t>Premiere</w:t>
+      </w:r>
+      <w:r>
+        <w:rPr>
+          <w:spacing w:val="-7"/>
+        </w:rPr>
+        <w:t xml:space="preserve"> </w:t>
+      </w:r>
+      <w:r>
+        <w:rPr>
           <w:spacing w:val="-5"/>
         </w:rPr>
-        <w:t>Related Coursework:</w:t>
-      </w:r>
-      <w:r>
-        <w:rPr>
-          <w:b/>
+        <w:t>Pro</w:t>
+      </w:r>
+      <w:r>
+        <w:rPr>
           <w:spacing w:val="-5"/>
         </w:rPr>
-        <w:t xml:space="preserve"> </w:t>
-      </w:r>
-      <w:r>
-        <w:t>Introduction</w:t>
-      </w:r>
-      <w:r>
-        <w:rPr>
-          <w:spacing w:val="-11"/>
-        </w:rPr>
-        <w:t xml:space="preserve"> </w:t>
-      </w:r>
-      <w:r>
-        <w:t>to</w:t>
-      </w:r>
-      <w:r>
-        <w:rPr>
-          <w:spacing w:val="-8"/>
-        </w:rPr>
-        <w:t xml:space="preserve"> </w:t>
-      </w:r>
-      <w:r>
-        <w:t>Digital</w:t>
-      </w:r>
-      <w:r>
-        <w:rPr>
-          <w:spacing w:val="-8"/>
-        </w:rPr>
-        <w:t xml:space="preserve"> </w:t>
-      </w:r>
-      <w:r>
-        <w:t>Media</w:t>
-      </w:r>
-      <w:r>
-        <w:t xml:space="preserve">, </w:t>
-      </w:r>
-      <w:r>
-        <w:t>Introduction</w:t>
-      </w:r>
-      <w:r>
-        <w:rPr>
-          <w:spacing w:val="-10"/>
-        </w:rPr>
-        <w:t xml:space="preserve"> </w:t>
-      </w:r>
-      <w:r>
-        <w:t>to</w:t>
-      </w:r>
-      <w:r>
-        <w:rPr>
-          <w:spacing w:val="-8"/>
-        </w:rPr>
-        <w:t xml:space="preserve"> </w:t>
-      </w:r>
-      <w:r>
-        <w:t>Digital</w:t>
-      </w:r>
-      <w:r>
-        <w:rPr>
-          <w:spacing w:val="-8"/>
-        </w:rPr>
-        <w:t xml:space="preserve"> </w:t>
-      </w:r>
-      <w:r>
-        <w:t>Video</w:t>
-      </w:r>
-      <w:r>
-        <w:rPr>
-          <w:spacing w:val="-7"/>
-        </w:rPr>
-        <w:t xml:space="preserve"> </w:t>
-      </w:r>
-      <w:r>
-        <w:t>Art</w:t>
-      </w:r>
-      <w:r>
-        <w:t xml:space="preserve">, </w:t>
-      </w:r>
-      <w:r>
-        <w:t>Intro</w:t>
-      </w:r>
-      <w:r>
-        <w:rPr>
-          <w:spacing w:val="-8"/>
-        </w:rPr>
-        <w:t xml:space="preserve"> </w:t>
-      </w:r>
-      <w:r>
-        <w:t>to</w:t>
-      </w:r>
-      <w:r>
-        <w:rPr>
-          <w:spacing w:val="-6"/>
-        </w:rPr>
-        <w:t xml:space="preserve"> </w:t>
-      </w:r>
-      <w:r>
-        <w:t>Creative</w:t>
-      </w:r>
-      <w:r>
-        <w:rPr>
-          <w:spacing w:val="-5"/>
-        </w:rPr>
-        <w:t xml:space="preserve"> </w:t>
-      </w:r>
-      <w:r>
-        <w:t>Coding</w:t>
-      </w:r>
-      <w:r>
-        <w:t xml:space="preserve">, </w:t>
-      </w:r>
-      <w:r>
-        <w:t>3D Model and Print</w:t>
-      </w:r>
-      <w:r>
-        <w:t xml:space="preserve">, Advanced Video Production, Web </w:t>
-      </w:r>
-      <w:r>
-        <w:t>Development, Intro to Game Design</w:t>
-      </w:r>
-    </w:p>
-    <w:p>
-      <w:pPr>
-        <w:pStyle w:val="BodyText"/>
-        <w:tabs>
-          <w:tab w:val="right" w:pos="9180"/>
-        </w:tabs>
-        <w:ind w:left="0" w:firstLine="0"/>
-        <w:contextualSpacing/>
-        <w:rPr>
-          <w:sz w:val="22"/>
-          <w:szCs w:val="22"/>
+        <w:t>/XD, Blender, Canva, and Figma</w:t>
+      </w:r>
+    </w:p>
+    <w:p>
+      <w:pPr>
+        <w:contextualSpacing/>
+        <w:rPr>
+          <w:rFonts w:asciiTheme="minorHAnsi" w:hAnsiTheme="minorHAnsi" w:cstheme="minorHAnsi"/>
         </w:rPr>
       </w:pPr>
     </w:p>
@@ -634,7 +644,7 @@
           <w:sz w:val="22"/>
           <w:szCs w:val="22"/>
         </w:rPr>
-        <w:t xml:space="preserve">TECHNICAL </w:t>
+        <w:t>PROJECT</w:t>
       </w:r>
       <w:r>
         <w:rPr>
@@ -642,169 +652,7 @@
           <w:sz w:val="22"/>
           <w:szCs w:val="22"/>
         </w:rPr>
-        <w:t>SKILLS</w:t>
-      </w:r>
-    </w:p>
-    <w:p>
-      <w:pPr>
-        <w:pStyle w:val="ListParagraph"/>
-        <w:numPr>
-          <w:ilvl w:val="0"/>
-          <w:numId w:val="7"/>
-        </w:numPr>
-        <w:contextualSpacing/>
-      </w:pPr>
-      <w:r>
-        <w:rPr>
-          <w:b/>
-        </w:rPr>
-        <w:t>Programming:</w:t>
-      </w:r>
-      <w:r>
-        <w:t xml:space="preserve"> </w:t>
-      </w:r>
-      <w:r>
-        <w:t>Proficient in</w:t>
-      </w:r>
-      <w:r>
-        <w:rPr>
-          <w:spacing w:val="-4"/>
-        </w:rPr>
-        <w:t xml:space="preserve"> </w:t>
-      </w:r>
-      <w:r>
-        <w:t>HTML/CSS/</w:t>
-      </w:r>
-      <w:r>
-        <w:t>JavaScript</w:t>
-      </w:r>
-    </w:p>
-    <w:p>
-      <w:pPr>
-        <w:pStyle w:val="ListParagraph"/>
-        <w:numPr>
-          <w:ilvl w:val="0"/>
-          <w:numId w:val="7"/>
-        </w:numPr>
-        <w:contextualSpacing/>
-      </w:pPr>
-      <w:r>
-        <w:rPr>
-          <w:b/>
-        </w:rPr>
-        <w:t>Design Software:</w:t>
-      </w:r>
-      <w:r>
-        <w:t xml:space="preserve"> Proficient in</w:t>
-      </w:r>
-      <w:r>
-        <w:rPr>
-          <w:spacing w:val="-7"/>
-        </w:rPr>
-        <w:t xml:space="preserve"> </w:t>
-      </w:r>
-      <w:r>
-        <w:t>Adobe After Effects/Illustrator/</w:t>
-      </w:r>
-      <w:r>
-        <w:t>Photoshop/</w:t>
-      </w:r>
-      <w:r>
-        <w:t>Premiere</w:t>
-      </w:r>
-      <w:r>
-        <w:rPr>
-          <w:spacing w:val="-7"/>
-        </w:rPr>
-        <w:t xml:space="preserve"> </w:t>
-      </w:r>
-      <w:r>
-        <w:rPr>
-          <w:spacing w:val="-5"/>
-        </w:rPr>
-        <w:t>Pro</w:t>
-      </w:r>
-      <w:r>
-        <w:rPr>
-          <w:spacing w:val="-5"/>
-        </w:rPr>
-        <w:t>/XD</w:t>
-      </w:r>
-      <w:r>
-        <w:rPr>
-          <w:spacing w:val="-5"/>
-        </w:rPr>
-        <w:t>, Blender</w:t>
-      </w:r>
-      <w:r>
-        <w:rPr>
-          <w:spacing w:val="-5"/>
-        </w:rPr>
-        <w:t>,</w:t>
-      </w:r>
-      <w:r>
-        <w:rPr>
-          <w:spacing w:val="-5"/>
-        </w:rPr>
-        <w:t xml:space="preserve"> Canva, and</w:t>
-      </w:r>
-      <w:r>
-        <w:rPr>
-          <w:spacing w:val="-5"/>
-        </w:rPr>
-        <w:t xml:space="preserve"> Figma</w:t>
-      </w:r>
-    </w:p>
-    <w:p>
-      <w:pPr>
-        <w:pStyle w:val="BodyText"/>
-        <w:tabs>
-          <w:tab w:val="right" w:pos="9180"/>
-        </w:tabs>
-        <w:ind w:left="0" w:firstLine="0"/>
-        <w:contextualSpacing/>
-        <w:rPr>
-          <w:sz w:val="22"/>
-          <w:szCs w:val="22"/>
-        </w:rPr>
-      </w:pPr>
-    </w:p>
-    <w:p>
-      <w:pPr>
-        <w:pStyle w:val="Heading1"/>
-        <w:tabs>
-          <w:tab w:val="right" w:pos="9180"/>
-          <w:tab w:val="right" w:pos="10800"/>
-        </w:tabs>
-        <w:ind w:left="0"/>
-        <w:contextualSpacing/>
-        <w:rPr>
-          <w:sz w:val="22"/>
-          <w:szCs w:val="22"/>
-        </w:rPr>
-      </w:pPr>
-      <w:r>
-        <w:rPr>
-          <w:sz w:val="22"/>
-          <w:szCs w:val="22"/>
-        </w:rPr>
-        <w:t>WORK</w:t>
-      </w:r>
-      <w:r>
-        <w:rPr>
-          <w:spacing w:val="-6"/>
-          <w:sz w:val="22"/>
-          <w:szCs w:val="22"/>
-        </w:rPr>
-        <w:t xml:space="preserve"> </w:t>
-      </w:r>
-      <w:r>
-        <w:rPr>
-          <w:spacing w:val="-2"/>
-          <w:sz w:val="22"/>
-          <w:szCs w:val="22"/>
-        </w:rPr>
-        <w:t>EXPERIENCE</w:t>
+        <w:t xml:space="preserve"> EXPERIENCE</w:t>
       </w:r>
     </w:p>
     <w:p>
@@ -818,132 +666,29 @@
         <w:rPr>
           <w:b/>
         </w:rPr>
-        <w:t>Web</w:t>
-      </w:r>
-      <w:r>
-        <w:rPr>
-          <w:b/>
-          <w:spacing w:val="-9"/>
-        </w:rPr>
-        <w:t xml:space="preserve"> </w:t>
-      </w:r>
-      <w:r>
-        <w:rPr>
-          <w:b/>
-        </w:rPr>
-        <w:t>Design</w:t>
-      </w:r>
-      <w:r>
-        <w:rPr>
-          <w:b/>
-          <w:spacing w:val="-9"/>
-        </w:rPr>
-        <w:t xml:space="preserve"> </w:t>
-      </w:r>
-      <w:r>
-        <w:rPr>
-          <w:b/>
-        </w:rPr>
-        <w:t>Student</w:t>
-      </w:r>
-      <w:r>
-        <w:rPr>
-          <w:b/>
-          <w:spacing w:val="-9"/>
-        </w:rPr>
-        <w:t xml:space="preserve"> </w:t>
-      </w:r>
-      <w:r>
-        <w:rPr>
-          <w:b/>
-        </w:rPr>
-        <w:t>Assistant,</w:t>
-      </w:r>
-      <w:r>
-        <w:rPr>
-          <w:b/>
-          <w:spacing w:val="-9"/>
-        </w:rPr>
-        <w:t xml:space="preserve"> </w:t>
+        <w:t xml:space="preserve">BFA Website, </w:t>
       </w:r>
       <w:r>
         <w:t xml:space="preserve">SJSU </w:t>
       </w:r>
       <w:r>
-        <w:t>College</w:t>
-      </w:r>
-      <w:r>
-        <w:rPr>
-          <w:spacing w:val="-11"/>
-        </w:rPr>
-        <w:t xml:space="preserve"> </w:t>
-      </w:r>
-      <w:r>
-        <w:t>of</w:t>
-      </w:r>
-      <w:r>
-        <w:rPr>
-          <w:spacing w:val="-9"/>
-        </w:rPr>
-        <w:t xml:space="preserve"> </w:t>
-      </w:r>
-      <w:r>
-        <w:t>Graduate</w:t>
-      </w:r>
-      <w:r>
-        <w:rPr>
-          <w:spacing w:val="-9"/>
-        </w:rPr>
-        <w:t xml:space="preserve"> </w:t>
-      </w:r>
-      <w:r>
-        <w:t>Studies</w:t>
-      </w:r>
-      <w:r>
-        <w:t>,</w:t>
-      </w:r>
-      <w:r>
-        <w:rPr>
-          <w:spacing w:val="-9"/>
-        </w:rPr>
-        <w:t xml:space="preserve"> </w:t>
-      </w:r>
-      <w:r>
-        <w:t>San</w:t>
-      </w:r>
-      <w:r>
-        <w:rPr>
-          <w:spacing w:val="-9"/>
-        </w:rPr>
-        <w:t xml:space="preserve"> </w:t>
-      </w:r>
-      <w:r>
-        <w:t>Jose,</w:t>
-      </w:r>
-      <w:r>
-        <w:rPr>
-          <w:spacing w:val="-8"/>
-        </w:rPr>
-        <w:t xml:space="preserve"> </w:t>
+        <w:t>Digital Media Art BFA Project</w:t>
+      </w:r>
+      <w:r>
+        <w:tab/>
+        <w:t>Nov</w:t>
       </w:r>
       <w:r>
         <w:rPr>
           <w:spacing w:val="-5"/>
         </w:rPr>
-        <w:t>CA</w:t>
-      </w:r>
-      <w:r>
-        <w:tab/>
-        <w:t>Aug</w:t>
-      </w:r>
-      <w:r>
-        <w:rPr>
-          <w:spacing w:val="-5"/>
-        </w:rPr>
-        <w:t xml:space="preserve"> </w:t>
-      </w:r>
-      <w:r>
-        <w:t>2022</w:t>
+        <w:t xml:space="preserve"> </w:t>
+      </w:r>
+      <w:r>
+        <w:t>202</w:t>
+      </w:r>
+      <w:r>
+        <w:t>3</w:t>
       </w:r>
       <w:r>
         <w:rPr>
@@ -952,357 +697,7 @@
         <w:t xml:space="preserve"> </w:t>
       </w:r>
       <w:r>
-        <w:t>–</w:t>
-      </w:r>
-      <w:r>
-        <w:rPr>
-          <w:spacing w:val="-2"/>
-        </w:rPr>
-        <w:t xml:space="preserve"> </w:t>
-      </w:r>
-      <w:r>
-        <w:rPr>
-          <w:spacing w:val="-2"/>
-        </w:rPr>
-        <w:t>December 2023</w:t>
-      </w:r>
-    </w:p>
-    <w:p>
-      <w:pPr>
-        <w:pStyle w:val="ListParagraph"/>
-        <w:numPr>
-          <w:ilvl w:val="0"/>
-          <w:numId w:val="11"/>
-        </w:numPr>
-        <w:contextualSpacing/>
-      </w:pPr>
-      <w:r>
-        <w:t>Design</w:t>
-      </w:r>
-      <w:r>
-        <w:t>ed</w:t>
-      </w:r>
-      <w:r>
-        <w:rPr>
-          <w:spacing w:val="-5"/>
-        </w:rPr>
-        <w:t xml:space="preserve"> </w:t>
-      </w:r>
-      <w:r>
-        <w:t>web</w:t>
-      </w:r>
-      <w:r>
-        <w:rPr>
-          <w:spacing w:val="-5"/>
-        </w:rPr>
-        <w:t xml:space="preserve"> </w:t>
-      </w:r>
-      <w:r>
-        <w:t>graphics</w:t>
-      </w:r>
-      <w:r>
-        <w:t>, posters,</w:t>
-      </w:r>
-      <w:r>
-        <w:t xml:space="preserve"> and </w:t>
-      </w:r>
-      <w:r>
-        <w:t>banners</w:t>
-      </w:r>
-      <w:r>
-        <w:rPr>
-          <w:spacing w:val="-5"/>
-        </w:rPr>
-        <w:t xml:space="preserve"> </w:t>
-      </w:r>
-      <w:r>
-        <w:t>for</w:t>
-      </w:r>
-      <w:r>
-        <w:rPr>
-          <w:spacing w:val="-5"/>
-        </w:rPr>
-        <w:t xml:space="preserve"> </w:t>
-      </w:r>
-      <w:r>
-        <w:t>College</w:t>
-      </w:r>
-      <w:r>
-        <w:rPr>
-          <w:spacing w:val="-5"/>
-        </w:rPr>
-        <w:t xml:space="preserve"> </w:t>
-      </w:r>
-      <w:r>
-        <w:t>of</w:t>
-      </w:r>
-      <w:r>
-        <w:rPr>
-          <w:spacing w:val="-5"/>
-        </w:rPr>
-        <w:t xml:space="preserve"> </w:t>
-      </w:r>
-      <w:r>
-        <w:t>Graduate</w:t>
-      </w:r>
-      <w:r>
-        <w:rPr>
-          <w:spacing w:val="-5"/>
-        </w:rPr>
-        <w:t xml:space="preserve"> </w:t>
-      </w:r>
-      <w:r>
-        <w:t>Studies</w:t>
-      </w:r>
-      <w:r>
-        <w:t>.</w:t>
-      </w:r>
-    </w:p>
-    <w:p>
-      <w:pPr>
-        <w:pStyle w:val="ListParagraph"/>
-        <w:numPr>
-          <w:ilvl w:val="0"/>
-          <w:numId w:val="11"/>
-        </w:numPr>
-        <w:contextualSpacing/>
-      </w:pPr>
-      <w:r>
-        <w:t>A</w:t>
-      </w:r>
-      <w:r>
-        <w:t>ssist</w:t>
-      </w:r>
-      <w:r>
-        <w:t>ed</w:t>
-      </w:r>
-      <w:r>
-        <w:t xml:space="preserve"> </w:t>
-      </w:r>
-      <w:r>
-        <w:t>students</w:t>
-      </w:r>
-      <w:r>
-        <w:rPr>
-          <w:spacing w:val="-5"/>
-        </w:rPr>
-        <w:t xml:space="preserve"> </w:t>
-      </w:r>
-      <w:r>
-        <w:t>with</w:t>
-      </w:r>
-      <w:r>
-        <w:rPr>
-          <w:spacing w:val="-5"/>
-        </w:rPr>
-        <w:t xml:space="preserve"> </w:t>
-      </w:r>
-      <w:r>
-        <w:t>admission</w:t>
-      </w:r>
-      <w:r>
-        <w:rPr>
-          <w:spacing w:val="-5"/>
-        </w:rPr>
-        <w:t xml:space="preserve"> </w:t>
-      </w:r>
-      <w:r>
-        <w:t>questions,</w:t>
-      </w:r>
-      <w:r>
-        <w:rPr>
-          <w:spacing w:val="-5"/>
-        </w:rPr>
-        <w:t xml:space="preserve"> </w:t>
-      </w:r>
-      <w:r>
-        <w:t>answer</w:t>
-      </w:r>
-      <w:r>
-        <w:t>ed</w:t>
-      </w:r>
-      <w:r>
-        <w:rPr>
-          <w:spacing w:val="-5"/>
-        </w:rPr>
-        <w:t xml:space="preserve"> </w:t>
-      </w:r>
-      <w:r>
-        <w:t>phone</w:t>
-      </w:r>
-      <w:r>
-        <w:rPr>
-          <w:spacing w:val="-5"/>
-        </w:rPr>
-        <w:t xml:space="preserve"> </w:t>
-      </w:r>
-      <w:r>
-        <w:t>calls,</w:t>
-      </w:r>
-      <w:r>
-        <w:rPr>
-          <w:spacing w:val="-5"/>
-        </w:rPr>
-        <w:t xml:space="preserve"> </w:t>
-      </w:r>
-      <w:r>
-        <w:t>and emails</w:t>
-      </w:r>
-      <w:r>
-        <w:t>.</w:t>
-      </w:r>
-    </w:p>
-    <w:p>
-      <w:pPr>
-        <w:pStyle w:val="ListParagraph"/>
-        <w:numPr>
-          <w:ilvl w:val="0"/>
-          <w:numId w:val="11"/>
-        </w:numPr>
-        <w:contextualSpacing/>
-      </w:pPr>
-      <w:r>
-        <w:t>Greet</w:t>
-      </w:r>
-      <w:r>
-        <w:t>ed</w:t>
-      </w:r>
-      <w:r>
-        <w:t xml:space="preserve"> visitors and </w:t>
-      </w:r>
-      <w:r>
-        <w:t>advise</w:t>
-      </w:r>
-      <w:r>
-        <w:t>d</w:t>
-      </w:r>
-      <w:r>
-        <w:t xml:space="preserve"> them on </w:t>
-      </w:r>
-      <w:r>
-        <w:t>their needs</w:t>
-      </w:r>
-      <w:r>
-        <w:t>.</w:t>
-      </w:r>
-    </w:p>
-    <w:p>
-      <w:pPr>
-        <w:tabs>
-          <w:tab w:val="right" w:pos="10800"/>
-        </w:tabs>
-        <w:ind w:left="119"/>
-        <w:contextualSpacing/>
-        <w:rPr>
-          <w:b/>
-        </w:rPr>
-      </w:pPr>
-    </w:p>
-    <w:p>
-      <w:pPr>
-        <w:tabs>
-          <w:tab w:val="right" w:pos="10800"/>
-        </w:tabs>
-        <w:contextualSpacing/>
-      </w:pPr>
-      <w:r>
-        <w:rPr>
-          <w:b/>
-        </w:rPr>
-        <w:t>Bookstore</w:t>
-      </w:r>
-      <w:r>
-        <w:rPr>
-          <w:b/>
-          <w:spacing w:val="-12"/>
-        </w:rPr>
-        <w:t xml:space="preserve"> </w:t>
-      </w:r>
-      <w:r>
-        <w:rPr>
-          <w:b/>
-        </w:rPr>
-        <w:t>Seller,</w:t>
-      </w:r>
-      <w:r>
-        <w:rPr>
-          <w:b/>
-          <w:spacing w:val="-10"/>
-        </w:rPr>
-        <w:t xml:space="preserve"> </w:t>
-      </w:r>
-      <w:r>
-        <w:t>Barnes</w:t>
-      </w:r>
-      <w:r>
-        <w:rPr>
-          <w:spacing w:val="-10"/>
-        </w:rPr>
-        <w:t xml:space="preserve"> </w:t>
-      </w:r>
-      <w:r>
-        <w:t>and</w:t>
-      </w:r>
-      <w:r>
-        <w:rPr>
-          <w:spacing w:val="-10"/>
-        </w:rPr>
-        <w:t xml:space="preserve"> </w:t>
-      </w:r>
-      <w:r>
-        <w:t>Noble</w:t>
-      </w:r>
-      <w:r>
-        <w:rPr>
-          <w:spacing w:val="-10"/>
-        </w:rPr>
-        <w:t xml:space="preserve"> </w:t>
-      </w:r>
-      <w:r>
-        <w:t>College,</w:t>
-      </w:r>
-      <w:r>
-        <w:rPr>
-          <w:spacing w:val="-10"/>
-        </w:rPr>
-        <w:t xml:space="preserve"> </w:t>
-      </w:r>
-      <w:r>
-        <w:t>San</w:t>
-      </w:r>
-      <w:r>
-        <w:rPr>
-          <w:spacing w:val="-10"/>
-        </w:rPr>
-        <w:t xml:space="preserve"> </w:t>
-      </w:r>
-      <w:r>
-        <w:t>Francisco,</w:t>
-      </w:r>
-      <w:r>
-        <w:rPr>
-          <w:spacing w:val="-10"/>
-        </w:rPr>
-        <w:t xml:space="preserve"> </w:t>
-      </w:r>
-      <w:r>
-        <w:rPr>
-          <w:spacing w:val="-5"/>
-        </w:rPr>
-        <w:t>CA</w:t>
-      </w:r>
-      <w:r>
-        <w:tab/>
-        <w:t>Jun</w:t>
-      </w:r>
-      <w:r>
-        <w:rPr>
-          <w:spacing w:val="-5"/>
-        </w:rPr>
-        <w:t xml:space="preserve"> </w:t>
-      </w:r>
-      <w:r>
-        <w:t>2022</w:t>
+        <w:t>-</w:t>
       </w:r>
       <w:r>
         <w:rPr>
@@ -1311,264 +706,7 @@
         <w:t xml:space="preserve"> </w:t>
       </w:r>
       <w:r>
-        <w:t>-</w:t>
-      </w:r>
-      <w:r>
-        <w:rPr>
-          <w:spacing w:val="-3"/>
-        </w:rPr>
-        <w:t xml:space="preserve"> </w:t>
-      </w:r>
-      <w:r>
-        <w:t>Aug</w:t>
-      </w:r>
-      <w:r>
-        <w:rPr>
-          <w:spacing w:val="-2"/>
-        </w:rPr>
-        <w:t xml:space="preserve"> </w:t>
-      </w:r>
-      <w:r>
-        <w:rPr>
-          <w:spacing w:val="-4"/>
-        </w:rPr>
-        <w:t>2022</w:t>
-      </w:r>
-    </w:p>
-    <w:p>
-      <w:pPr>
-        <w:pStyle w:val="ListParagraph"/>
-        <w:numPr>
-          <w:ilvl w:val="0"/>
-          <w:numId w:val="10"/>
-        </w:numPr>
-        <w:contextualSpacing/>
-      </w:pPr>
-      <w:r>
-        <w:t>Marketed</w:t>
-      </w:r>
-      <w:r>
-        <w:rPr>
-          <w:spacing w:val="-8"/>
-        </w:rPr>
-        <w:t xml:space="preserve"> </w:t>
-      </w:r>
-      <w:r>
-        <w:t>merchandise,</w:t>
-      </w:r>
-      <w:r>
-        <w:rPr>
-          <w:spacing w:val="-8"/>
-        </w:rPr>
-        <w:t xml:space="preserve"> </w:t>
-      </w:r>
-      <w:r>
-        <w:t>assisted</w:t>
-      </w:r>
-      <w:r>
-        <w:rPr>
-          <w:spacing w:val="-8"/>
-        </w:rPr>
-        <w:t xml:space="preserve"> </w:t>
-      </w:r>
-      <w:r>
-        <w:t>customers</w:t>
-      </w:r>
-      <w:r>
-        <w:rPr>
-          <w:spacing w:val="-8"/>
-        </w:rPr>
-        <w:t xml:space="preserve"> </w:t>
-      </w:r>
-      <w:r>
-        <w:t>with</w:t>
-      </w:r>
-      <w:r>
-        <w:rPr>
-          <w:spacing w:val="-8"/>
-        </w:rPr>
-        <w:t xml:space="preserve"> </w:t>
-      </w:r>
-      <w:r>
-        <w:t>questions,</w:t>
-      </w:r>
-      <w:r>
-        <w:rPr>
-          <w:spacing w:val="-8"/>
-        </w:rPr>
-        <w:t xml:space="preserve"> </w:t>
-      </w:r>
-      <w:r>
-        <w:t>designed</w:t>
-      </w:r>
-      <w:r>
-        <w:rPr>
-          <w:spacing w:val="-8"/>
-        </w:rPr>
-        <w:t xml:space="preserve"> </w:t>
-      </w:r>
-      <w:r>
-        <w:t>store</w:t>
-      </w:r>
-      <w:r>
-        <w:rPr>
-          <w:spacing w:val="-8"/>
-        </w:rPr>
-        <w:t xml:space="preserve"> </w:t>
-      </w:r>
-      <w:r>
-        <w:t>product</w:t>
-      </w:r>
-      <w:r>
-        <w:rPr>
-          <w:spacing w:val="-8"/>
-        </w:rPr>
-        <w:t xml:space="preserve"> </w:t>
-      </w:r>
-      <w:r>
-        <w:t>arrangements</w:t>
-      </w:r>
-      <w:r>
-        <w:t>.</w:t>
-      </w:r>
-    </w:p>
-    <w:p>
-      <w:pPr>
-        <w:pStyle w:val="ListParagraph"/>
-        <w:numPr>
-          <w:ilvl w:val="0"/>
-          <w:numId w:val="10"/>
-        </w:numPr>
-        <w:contextualSpacing/>
-      </w:pPr>
-      <w:r>
-        <w:t xml:space="preserve">Collaborated with </w:t>
-      </w:r>
-      <w:r>
-        <w:t>colleagues to set up the store</w:t>
-      </w:r>
-      <w:r>
-        <w:t xml:space="preserve"> to ensure</w:t>
-      </w:r>
-      <w:r>
-        <w:t xml:space="preserve"> visually appealing stock</w:t>
-      </w:r>
-      <w:r>
-        <w:t>.</w:t>
-      </w:r>
-    </w:p>
-    <w:p>
-      <w:pPr>
-        <w:pStyle w:val="ListParagraph"/>
-        <w:numPr>
-          <w:ilvl w:val="0"/>
-          <w:numId w:val="10"/>
-        </w:numPr>
-        <w:contextualSpacing/>
-      </w:pPr>
-      <w:r>
-        <w:t>Unpacked boxes, organized product placements, delivered textbooks</w:t>
-      </w:r>
-      <w:r>
-        <w:t>.</w:t>
-      </w:r>
-    </w:p>
-    <w:p>
-      <w:pPr>
-        <w:pStyle w:val="Heading1"/>
-        <w:tabs>
-          <w:tab w:val="right" w:pos="9180"/>
-        </w:tabs>
-        <w:contextualSpacing/>
-        <w:rPr>
-          <w:spacing w:val="-2"/>
-          <w:sz w:val="22"/>
-          <w:szCs w:val="22"/>
-        </w:rPr>
-      </w:pPr>
-    </w:p>
-    <w:p>
-      <w:pPr>
-        <w:pStyle w:val="Heading1"/>
-        <w:tabs>
-          <w:tab w:val="right" w:pos="9180"/>
-        </w:tabs>
-        <w:ind w:left="0"/>
-        <w:contextualSpacing/>
-        <w:rPr>
-          <w:sz w:val="22"/>
-          <w:szCs w:val="22"/>
-        </w:rPr>
-      </w:pPr>
-      <w:r>
-        <w:rPr>
-          <w:spacing w:val="-2"/>
-          <w:sz w:val="22"/>
-          <w:szCs w:val="22"/>
-        </w:rPr>
-        <w:t>PROJECT</w:t>
-      </w:r>
-      <w:r>
-        <w:rPr>
-          <w:spacing w:val="-2"/>
-          <w:sz w:val="22"/>
-          <w:szCs w:val="22"/>
-        </w:rPr>
-        <w:t xml:space="preserve"> EXPERIENCE</w:t>
-      </w:r>
-    </w:p>
-    <w:p>
-      <w:pPr>
-        <w:tabs>
-          <w:tab w:val="right" w:pos="10800"/>
-        </w:tabs>
-        <w:contextualSpacing/>
-      </w:pPr>
-      <w:r>
-        <w:rPr>
-          <w:b/>
-        </w:rPr>
-        <w:t xml:space="preserve">BFA Website, </w:t>
-      </w:r>
-      <w:r>
-        <w:t xml:space="preserve">SJSU </w:t>
-      </w:r>
-      <w:r>
-        <w:t>Digital Media Art BFA Project</w:t>
-      </w:r>
-      <w:r>
-        <w:tab/>
-        <w:t>November</w:t>
-      </w:r>
-      <w:r>
-        <w:rPr>
-          <w:spacing w:val="-5"/>
-        </w:rPr>
-        <w:t xml:space="preserve"> </w:t>
-      </w:r>
-      <w:r>
-        <w:t>202</w:t>
-      </w:r>
-      <w:r>
-        <w:t>3</w:t>
-      </w:r>
-      <w:r>
-        <w:rPr>
-          <w:spacing w:val="-3"/>
-        </w:rPr>
-        <w:t xml:space="preserve"> </w:t>
-      </w:r>
-      <w:r>
-        <w:t>-</w:t>
-      </w:r>
-      <w:r>
-        <w:rPr>
-          <w:spacing w:val="-3"/>
-        </w:rPr>
-        <w:t xml:space="preserve"> </w:t>
-      </w:r>
-      <w:r>
-        <w:t>December</w:t>
+        <w:t>Dec</w:t>
       </w:r>
       <w:r>
         <w:rPr>
@@ -1605,25 +743,7 @@
         </w:rPr>
       </w:pPr>
       <w:r>
-        <w:t>Direct</w:t>
-      </w:r>
-      <w:r>
-        <w:t>ed</w:t>
-      </w:r>
-      <w:r>
-        <w:t xml:space="preserve"> a team of 4 students</w:t>
-      </w:r>
-      <w:r>
-        <w:t xml:space="preserve"> to create a website that documented </w:t>
-      </w:r>
-      <w:r>
-        <w:t xml:space="preserve">the </w:t>
-      </w:r>
-      <w:r>
-        <w:t xml:space="preserve">graduating seniors’ </w:t>
-      </w:r>
-      <w:r>
-        <w:t>projects.</w:t>
+        <w:t>Directed a team of 4 students to create a website that documented the graduating seniors’ projects.</w:t>
       </w:r>
     </w:p>
     <w:p>
@@ -1645,25 +765,7 @@
         <w:rPr>
           <w:bCs/>
         </w:rPr>
-        <w:t>Represented the team in meetings with technical</w:t>
-      </w:r>
-      <w:r>
-        <w:rPr>
-          <w:bCs/>
-        </w:rPr>
-        <w:t xml:space="preserve"> and </w:t>
-      </w:r>
-      <w:r>
-        <w:rPr>
-          <w:bCs/>
-        </w:rPr>
-        <w:t xml:space="preserve">promotional </w:t>
-      </w:r>
-      <w:r>
-        <w:rPr>
-          <w:bCs/>
-        </w:rPr>
-        <w:t>staff.</w:t>
+        <w:t>Represented the team in meetings with technical and promotional staff.</w:t>
       </w:r>
     </w:p>
     <w:p>
@@ -1710,25 +812,14 @@
         <w:rPr>
           <w:b/>
         </w:rPr>
-        <w:t>MySJSU Case Study</w:t>
-      </w:r>
-      <w:r>
-        <w:rPr>
-          <w:b/>
-        </w:rPr>
-        <w:t xml:space="preserve">, </w:t>
-      </w:r>
-      <w:r>
-        <w:t>Personal</w:t>
-      </w:r>
-      <w:r>
-        <w:t xml:space="preserve"> Project</w:t>
+        <w:t xml:space="preserve">MySJSU Case Study, </w:t>
+      </w:r>
+      <w:r>
+        <w:t>Personal Project</w:t>
       </w:r>
       <w:r>
         <w:tab/>
-      </w:r>
-      <w:r>
-        <w:t>October</w:t>
+        <w:t>Oct</w:t>
       </w:r>
       <w:r>
         <w:rPr>
@@ -1758,7 +849,7 @@
         <w:t xml:space="preserve"> </w:t>
       </w:r>
       <w:r>
-        <w:t>November</w:t>
+        <w:t>Nov</w:t>
       </w:r>
       <w:r>
         <w:rPr>
@@ -1795,10 +886,7 @@
         </w:rPr>
       </w:pPr>
       <w:r>
-        <w:t>Redesigned</w:t>
-      </w:r>
-      <w:r>
-        <w:t xml:space="preserve"> the MySJSU page by changing the layout, colors, and visual direction of the site.</w:t>
+        <w:t>Redesigned the MySJSU page by changing the layout, colors, and visual direction of the site.</w:t>
       </w:r>
     </w:p>
     <w:p>
@@ -1817,16 +905,7 @@
         </w:rPr>
       </w:pPr>
       <w:r>
-        <w:t xml:space="preserve">Surveyed 9 students </w:t>
-      </w:r>
-      <w:r>
-        <w:t>to understand</w:t>
-      </w:r>
-      <w:r>
-        <w:t xml:space="preserve"> their pain points and </w:t>
-      </w:r>
-      <w:r>
-        <w:t>impression of MySJSU.</w:t>
+        <w:t>Surveyed 9 students to understand their pain points and impression of MySJSU.</w:t>
       </w:r>
     </w:p>
     <w:p>
@@ -1848,19 +927,7 @@
         <w:rPr>
           <w:bCs/>
         </w:rPr>
-        <w:t xml:space="preserve">Built low and </w:t>
-      </w:r>
-      <w:r>
-        <w:rPr>
-          <w:bCs/>
-        </w:rPr>
-        <w:t>high-fidelity</w:t>
-      </w:r>
-      <w:r>
-        <w:rPr>
-          <w:bCs/>
-        </w:rPr>
-        <w:t xml:space="preserve"> prototypes, according to the responses given.</w:t>
+        <w:t>Built low and high-fidelity prototypes, according to the responses given.</w:t>
       </w:r>
     </w:p>
     <w:p>
@@ -1903,15 +970,10 @@
         <w:t>SJSU Department</w:t>
       </w:r>
       <w:r>
-        <w:t xml:space="preserve"> of </w:t>
-      </w:r>
-      <w:r>
-        <w:t>Digital Media Art</w:t>
+        <w:t xml:space="preserve"> of Digital Media Art</w:t>
       </w:r>
       <w:r>
         <w:tab/>
-      </w:r>
-      <w:r>
         <w:t>Dec</w:t>
       </w:r>
       <w:r>
@@ -2103,19 +1165,7 @@
         <w:rPr>
           <w:spacing w:val="-2"/>
         </w:rPr>
-        <w:t xml:space="preserve">Added mobile </w:t>
-      </w:r>
-      <w:r>
-        <w:rPr>
-          <w:spacing w:val="-2"/>
-        </w:rPr>
-        <w:t>responsiveness</w:t>
-      </w:r>
-      <w:r>
-        <w:rPr>
-          <w:spacing w:val="-2"/>
-        </w:rPr>
-        <w:t>.</w:t>
+        <w:t>Added mobile responsiveness.</w:t>
       </w:r>
     </w:p>
     <w:p>
@@ -2142,14 +1192,933 @@
         <w:pStyle w:val="Heading1"/>
         <w:tabs>
           <w:tab w:val="right" w:pos="9180"/>
+          <w:tab w:val="right" w:pos="10800"/>
         </w:tabs>
         <w:ind w:left="0"/>
         <w:contextualSpacing/>
         <w:rPr>
+          <w:rFonts w:asciiTheme="minorHAnsi" w:hAnsiTheme="minorHAnsi" w:cstheme="minorHAnsi"/>
+          <w:sz w:val="22"/>
+          <w:szCs w:val="22"/>
+        </w:rPr>
+      </w:pPr>
+    </w:p>
+    <w:p>
+      <w:pPr>
+        <w:pStyle w:val="Heading1"/>
+        <w:tabs>
+          <w:tab w:val="right" w:pos="9180"/>
+          <w:tab w:val="right" w:pos="10800"/>
+        </w:tabs>
+        <w:ind w:left="0"/>
+        <w:contextualSpacing/>
+        <w:rPr>
+          <w:rFonts w:asciiTheme="minorHAnsi" w:hAnsiTheme="minorHAnsi" w:cstheme="minorHAnsi"/>
+          <w:sz w:val="22"/>
+          <w:szCs w:val="22"/>
+        </w:rPr>
+      </w:pPr>
+      <w:r>
+        <w:rPr>
+          <w:rFonts w:asciiTheme="minorHAnsi" w:hAnsiTheme="minorHAnsi" w:cstheme="minorHAnsi"/>
+          <w:sz w:val="22"/>
+          <w:szCs w:val="22"/>
+        </w:rPr>
+        <w:t>WORK</w:t>
+      </w:r>
+      <w:r>
+        <w:rPr>
+          <w:rFonts w:asciiTheme="minorHAnsi" w:hAnsiTheme="minorHAnsi" w:cstheme="minorHAnsi"/>
+          <w:spacing w:val="-6"/>
+          <w:sz w:val="22"/>
+          <w:szCs w:val="22"/>
+        </w:rPr>
+        <w:t xml:space="preserve"> </w:t>
+      </w:r>
+      <w:r>
+        <w:rPr>
+          <w:rFonts w:asciiTheme="minorHAnsi" w:hAnsiTheme="minorHAnsi" w:cstheme="minorHAnsi"/>
           <w:spacing w:val="-2"/>
           <w:sz w:val="22"/>
           <w:szCs w:val="22"/>
         </w:rPr>
+        <w:t>EXPERIENCE</w:t>
+      </w:r>
+    </w:p>
+    <w:p>
+      <w:pPr>
+        <w:tabs>
+          <w:tab w:val="right" w:pos="10800"/>
+        </w:tabs>
+        <w:contextualSpacing/>
+      </w:pPr>
+      <w:r>
+        <w:rPr>
+          <w:b/>
+        </w:rPr>
+        <w:t>Front Desk Receptionist</w:t>
+      </w:r>
+      <w:r>
+        <w:rPr>
+          <w:b/>
+        </w:rPr>
+        <w:t>,</w:t>
+      </w:r>
+      <w:r>
+        <w:rPr>
+          <w:b/>
+          <w:spacing w:val="-9"/>
+        </w:rPr>
+        <w:t xml:space="preserve"> </w:t>
+      </w:r>
+      <w:r>
+        <w:t>Palihotel</w:t>
+      </w:r>
+      <w:r>
+        <w:t>,</w:t>
+      </w:r>
+      <w:r>
+        <w:rPr>
+          <w:spacing w:val="-9"/>
+        </w:rPr>
+        <w:t xml:space="preserve"> </w:t>
+      </w:r>
+      <w:r>
+        <w:t>San</w:t>
+      </w:r>
+      <w:r>
+        <w:rPr>
+          <w:spacing w:val="-9"/>
+        </w:rPr>
+        <w:t xml:space="preserve"> </w:t>
+      </w:r>
+      <w:r>
+        <w:t>Francisco</w:t>
+      </w:r>
+      <w:r>
+        <w:t>,</w:t>
+      </w:r>
+      <w:r>
+        <w:rPr>
+          <w:spacing w:val="-8"/>
+        </w:rPr>
+        <w:t xml:space="preserve"> </w:t>
+      </w:r>
+      <w:r>
+        <w:rPr>
+          <w:spacing w:val="-5"/>
+        </w:rPr>
+        <w:t>CA</w:t>
+      </w:r>
+      <w:r>
+        <w:tab/>
+      </w:r>
+      <w:r>
+        <w:t>Oct</w:t>
+      </w:r>
+      <w:r>
+        <w:rPr>
+          <w:spacing w:val="-5"/>
+        </w:rPr>
+        <w:t xml:space="preserve"> </w:t>
+      </w:r>
+      <w:r>
+        <w:t>202</w:t>
+      </w:r>
+      <w:r>
+        <w:t>4</w:t>
+      </w:r>
+      <w:r>
+        <w:rPr>
+          <w:spacing w:val="-3"/>
+        </w:rPr>
+        <w:t xml:space="preserve"> </w:t>
+      </w:r>
+      <w:r>
+        <w:t>–</w:t>
+      </w:r>
+      <w:r>
+        <w:rPr>
+          <w:spacing w:val="-2"/>
+        </w:rPr>
+        <w:t xml:space="preserve"> </w:t>
+      </w:r>
+      <w:r>
+        <w:rPr>
+          <w:spacing w:val="-2"/>
+        </w:rPr>
+        <w:t>Jan</w:t>
+      </w:r>
+      <w:r>
+        <w:rPr>
+          <w:spacing w:val="-2"/>
+        </w:rPr>
+        <w:t xml:space="preserve"> </w:t>
+      </w:r>
+      <w:r>
+        <w:rPr>
+          <w:spacing w:val="-2"/>
+        </w:rPr>
+        <w:t>2025</w:t>
+      </w:r>
+    </w:p>
+    <w:p>
+      <w:pPr>
+        <w:pStyle w:val="ListParagraph"/>
+        <w:numPr>
+          <w:ilvl w:val="0"/>
+          <w:numId w:val="11"/>
+        </w:numPr>
+        <w:contextualSpacing/>
+      </w:pPr>
+      <w:r>
+        <w:t xml:space="preserve">Took </w:t>
+      </w:r>
+      <w:r>
+        <w:t xml:space="preserve">care to deliver a </w:t>
+      </w:r>
+      <w:r>
+        <w:t>professional and friendly</w:t>
+      </w:r>
+      <w:r>
+        <w:t xml:space="preserve"> </w:t>
+      </w:r>
+      <w:r>
+        <w:t xml:space="preserve">experience </w:t>
+      </w:r>
+      <w:r>
+        <w:t>for guests from check-in/check-out process, to billing, answering questions</w:t>
+      </w:r>
+      <w:r>
+        <w:t xml:space="preserve"> about</w:t>
+      </w:r>
+      <w:r>
+        <w:t xml:space="preserve"> </w:t>
+      </w:r>
+      <w:r>
+        <w:t>a hotel stay</w:t>
+      </w:r>
+      <w:r>
+        <w:t>.</w:t>
+      </w:r>
+      <w:r>
+        <w:t xml:space="preserve"> Provide</w:t>
+      </w:r>
+      <w:r>
+        <w:t>d</w:t>
+      </w:r>
+      <w:r>
+        <w:t xml:space="preserve"> a wide variety of recommendations on where to dine, attractions, and special events.</w:t>
+      </w:r>
+    </w:p>
+    <w:p>
+      <w:pPr>
+        <w:pStyle w:val="ListParagraph"/>
+        <w:numPr>
+          <w:ilvl w:val="0"/>
+          <w:numId w:val="11"/>
+        </w:numPr>
+        <w:contextualSpacing/>
+      </w:pPr>
+      <w:r>
+        <w:t>Handle</w:t>
+      </w:r>
+      <w:r>
+        <w:t>d</w:t>
+      </w:r>
+      <w:r>
+        <w:t xml:space="preserve"> phone calls with professionalism and great care to detail. </w:t>
+      </w:r>
+      <w:r>
+        <w:t>Forward</w:t>
+      </w:r>
+      <w:r>
+        <w:t>ed</w:t>
+      </w:r>
+      <w:r>
+        <w:t xml:space="preserve"> calls to proper departments and ensures </w:t>
+      </w:r>
+      <w:r>
+        <w:t>timely and accurate</w:t>
+      </w:r>
+      <w:r>
+        <w:t xml:space="preserve"> communication between all parties. </w:t>
+      </w:r>
+      <w:r>
+        <w:t>Tailor</w:t>
+      </w:r>
+      <w:r>
+        <w:t>ed</w:t>
+      </w:r>
+      <w:r>
+        <w:t xml:space="preserve"> each situation for each </w:t>
+      </w:r>
+      <w:r>
+        <w:t>guest’s</w:t>
+      </w:r>
+      <w:r>
+        <w:t xml:space="preserve"> specific needs.</w:t>
+      </w:r>
+    </w:p>
+    <w:p>
+      <w:pPr>
+        <w:pStyle w:val="ListParagraph"/>
+        <w:numPr>
+          <w:ilvl w:val="0"/>
+          <w:numId w:val="11"/>
+        </w:numPr>
+        <w:contextualSpacing/>
+      </w:pPr>
+      <w:r>
+        <w:t>Perform</w:t>
+      </w:r>
+      <w:r>
+        <w:t>ed</w:t>
+      </w:r>
+      <w:r>
+        <w:t xml:space="preserve"> clerical duties, such as setting up routing for guests, printing arrival/departures reports, and maintaining the hotel email inbox.</w:t>
+      </w:r>
+    </w:p>
+    <w:p>
+      <w:pPr>
+        <w:contextualSpacing/>
+      </w:pPr>
+      <w:r>
+        <w:rPr>
+          <w:b/>
+        </w:rPr>
+        <w:t>Office Student Assistant</w:t>
+      </w:r>
+      <w:r>
+        <w:rPr>
+          <w:b/>
+        </w:rPr>
+        <w:t>,</w:t>
+      </w:r>
+      <w:r>
+        <w:rPr>
+          <w:b/>
+          <w:spacing w:val="-9"/>
+        </w:rPr>
+        <w:t xml:space="preserve"> </w:t>
+      </w:r>
+      <w:r>
+        <w:t xml:space="preserve">SJSU </w:t>
+      </w:r>
+      <w:r>
+        <w:t>College</w:t>
+      </w:r>
+      <w:r>
+        <w:rPr>
+          <w:spacing w:val="-11"/>
+        </w:rPr>
+        <w:t xml:space="preserve"> </w:t>
+      </w:r>
+      <w:r>
+        <w:t>of</w:t>
+      </w:r>
+      <w:r>
+        <w:rPr>
+          <w:spacing w:val="-9"/>
+        </w:rPr>
+        <w:t xml:space="preserve"> </w:t>
+      </w:r>
+      <w:r>
+        <w:t>Graduate</w:t>
+      </w:r>
+      <w:r>
+        <w:rPr>
+          <w:spacing w:val="-9"/>
+        </w:rPr>
+        <w:t xml:space="preserve"> </w:t>
+      </w:r>
+      <w:r>
+        <w:t>Studies</w:t>
+      </w:r>
+      <w:r>
+        <w:t>,</w:t>
+      </w:r>
+      <w:r>
+        <w:rPr>
+          <w:spacing w:val="-9"/>
+        </w:rPr>
+        <w:t xml:space="preserve"> </w:t>
+      </w:r>
+      <w:r>
+        <w:t>San</w:t>
+      </w:r>
+      <w:r>
+        <w:rPr>
+          <w:spacing w:val="-9"/>
+        </w:rPr>
+        <w:t xml:space="preserve"> </w:t>
+      </w:r>
+      <w:r>
+        <w:t>Jose,</w:t>
+      </w:r>
+      <w:r>
+        <w:rPr>
+          <w:spacing w:val="-8"/>
+        </w:rPr>
+        <w:t xml:space="preserve"> </w:t>
+      </w:r>
+      <w:r>
+        <w:rPr>
+          <w:spacing w:val="-5"/>
+        </w:rPr>
+        <w:t>CA</w:t>
+      </w:r>
+      <w:r>
+        <w:tab/>
+      </w:r>
+      <w:r>
+        <w:t xml:space="preserve">                                              </w:t>
+      </w:r>
+      <w:r>
+        <w:t xml:space="preserve"> </w:t>
+      </w:r>
+      <w:r>
+        <w:t xml:space="preserve">  </w:t>
+      </w:r>
+      <w:r>
+        <w:t>Aug</w:t>
+      </w:r>
+      <w:r>
+        <w:rPr>
+          <w:spacing w:val="-5"/>
+        </w:rPr>
+        <w:t xml:space="preserve"> </w:t>
+      </w:r>
+      <w:r>
+        <w:t>2022</w:t>
+      </w:r>
+      <w:r>
+        <w:rPr>
+          <w:spacing w:val="-3"/>
+        </w:rPr>
+        <w:t xml:space="preserve"> </w:t>
+      </w:r>
+      <w:r>
+        <w:t>–</w:t>
+      </w:r>
+      <w:r>
+        <w:rPr>
+          <w:spacing w:val="-2"/>
+        </w:rPr>
+        <w:t xml:space="preserve"> </w:t>
+      </w:r>
+      <w:r>
+        <w:rPr>
+          <w:spacing w:val="-2"/>
+        </w:rPr>
+        <w:t>Dec 2023</w:t>
+      </w:r>
+    </w:p>
+    <w:p>
+      <w:pPr>
+        <w:pStyle w:val="ListParagraph"/>
+        <w:numPr>
+          <w:ilvl w:val="0"/>
+          <w:numId w:val="11"/>
+        </w:numPr>
+        <w:contextualSpacing/>
+      </w:pPr>
+      <w:r>
+        <w:t>Design</w:t>
+      </w:r>
+      <w:r>
+        <w:t>ed</w:t>
+      </w:r>
+      <w:r>
+        <w:rPr>
+          <w:spacing w:val="-5"/>
+        </w:rPr>
+        <w:t xml:space="preserve"> </w:t>
+      </w:r>
+      <w:r>
+        <w:t>web</w:t>
+      </w:r>
+      <w:r>
+        <w:rPr>
+          <w:spacing w:val="-5"/>
+        </w:rPr>
+        <w:t xml:space="preserve"> </w:t>
+      </w:r>
+      <w:r>
+        <w:t>graphics</w:t>
+      </w:r>
+      <w:r>
+        <w:t>, posters, and banners</w:t>
+      </w:r>
+      <w:r>
+        <w:rPr>
+          <w:spacing w:val="-5"/>
+        </w:rPr>
+        <w:t xml:space="preserve"> </w:t>
+      </w:r>
+      <w:r>
+        <w:t>for</w:t>
+      </w:r>
+      <w:r>
+        <w:rPr>
+          <w:spacing w:val="-5"/>
+        </w:rPr>
+        <w:t xml:space="preserve"> </w:t>
+      </w:r>
+      <w:r>
+        <w:t>department.</w:t>
+      </w:r>
+      <w:r>
+        <w:t xml:space="preserve"> </w:t>
+      </w:r>
+      <w:r>
+        <w:t xml:space="preserve">Compiled reports from student data, and maintained general clerical duties, such as printing posters, handling mail distribution and updating department website. </w:t>
+      </w:r>
+    </w:p>
+    <w:p>
+      <w:pPr>
+        <w:pStyle w:val="ListParagraph"/>
+        <w:numPr>
+          <w:ilvl w:val="0"/>
+          <w:numId w:val="11"/>
+        </w:numPr>
+        <w:contextualSpacing/>
+      </w:pPr>
+      <w:r>
+        <w:t xml:space="preserve">Displayed exceptional </w:t>
+      </w:r>
+      <w:r>
+        <w:t>care in</w:t>
+      </w:r>
+      <w:r>
+        <w:t xml:space="preserve"> greeting </w:t>
+      </w:r>
+      <w:r>
+        <w:t xml:space="preserve">visitors and </w:t>
+      </w:r>
+      <w:r>
+        <w:t>addressed</w:t>
+      </w:r>
+      <w:r>
+        <w:t xml:space="preserve"> their </w:t>
+      </w:r>
+      <w:r>
+        <w:t>concerns</w:t>
+      </w:r>
+      <w:r>
+        <w:t>, directing them to the proper offices</w:t>
+      </w:r>
+      <w:r>
+        <w:t>.</w:t>
+      </w:r>
+      <w:r>
+        <w:t xml:space="preserve"> </w:t>
+      </w:r>
+    </w:p>
+    <w:p>
+      <w:pPr>
+        <w:pStyle w:val="ListParagraph"/>
+        <w:numPr>
+          <w:ilvl w:val="0"/>
+          <w:numId w:val="11"/>
+        </w:numPr>
+        <w:contextualSpacing/>
+      </w:pPr>
+      <w:r>
+        <w:t>Assisted</w:t>
+      </w:r>
+      <w:r>
+        <w:t xml:space="preserve"> </w:t>
+      </w:r>
+      <w:r>
+        <w:t>students</w:t>
+      </w:r>
+      <w:r>
+        <w:t xml:space="preserve"> with</w:t>
+      </w:r>
+      <w:r>
+        <w:rPr>
+          <w:spacing w:val="-5"/>
+        </w:rPr>
+        <w:t xml:space="preserve"> </w:t>
+      </w:r>
+      <w:r>
+        <w:t>admission</w:t>
+      </w:r>
+      <w:r>
+        <w:rPr>
+          <w:spacing w:val="-5"/>
+        </w:rPr>
+        <w:t xml:space="preserve"> </w:t>
+      </w:r>
+      <w:r>
+        <w:t>information</w:t>
+      </w:r>
+      <w:r>
+        <w:t>,</w:t>
+      </w:r>
+      <w:r>
+        <w:rPr>
+          <w:spacing w:val="-5"/>
+        </w:rPr>
+        <w:t xml:space="preserve"> </w:t>
+      </w:r>
+      <w:r>
+        <w:t xml:space="preserve">answered and </w:t>
+      </w:r>
+      <w:r>
+        <w:t>returned</w:t>
+      </w:r>
+      <w:r>
+        <w:t xml:space="preserve"> </w:t>
+      </w:r>
+      <w:r>
+        <w:t>phone</w:t>
+      </w:r>
+      <w:r>
+        <w:rPr>
+          <w:spacing w:val="-5"/>
+        </w:rPr>
+        <w:t xml:space="preserve"> </w:t>
+      </w:r>
+      <w:r>
+        <w:t>calls</w:t>
+      </w:r>
+      <w:r>
+        <w:rPr>
+          <w:spacing w:val="-5"/>
+        </w:rPr>
+        <w:t>/</w:t>
+      </w:r>
+      <w:r>
+        <w:t>emails</w:t>
+      </w:r>
+      <w:r>
+        <w:t xml:space="preserve"> with a friendly and </w:t>
+      </w:r>
+      <w:r>
+        <w:t>professional</w:t>
+      </w:r>
+      <w:r>
+        <w:t xml:space="preserve"> personality</w:t>
+      </w:r>
+      <w:r>
+        <w:t>.</w:t>
+      </w:r>
+    </w:p>
+    <w:p>
+      <w:pPr>
+        <w:tabs>
+          <w:tab w:val="right" w:pos="10800"/>
+        </w:tabs>
+        <w:contextualSpacing/>
+        <w:rPr>
+          <w:b/>
+        </w:rPr>
+      </w:pPr>
+    </w:p>
+    <w:p>
+      <w:pPr>
+        <w:tabs>
+          <w:tab w:val="right" w:pos="10800"/>
+        </w:tabs>
+        <w:contextualSpacing/>
+      </w:pPr>
+      <w:r>
+        <w:rPr>
+          <w:b/>
+        </w:rPr>
+        <w:t>Sales Associate</w:t>
+      </w:r>
+      <w:r>
+        <w:rPr>
+          <w:b/>
+        </w:rPr>
+        <w:t>,</w:t>
+      </w:r>
+      <w:r>
+        <w:rPr>
+          <w:b/>
+          <w:spacing w:val="-10"/>
+        </w:rPr>
+        <w:t xml:space="preserve"> </w:t>
+      </w:r>
+      <w:r>
+        <w:t>Barnes</w:t>
+      </w:r>
+      <w:r>
+        <w:rPr>
+          <w:spacing w:val="-10"/>
+        </w:rPr>
+        <w:t xml:space="preserve"> </w:t>
+      </w:r>
+      <w:r>
+        <w:t>and</w:t>
+      </w:r>
+      <w:r>
+        <w:rPr>
+          <w:spacing w:val="-10"/>
+        </w:rPr>
+        <w:t xml:space="preserve"> </w:t>
+      </w:r>
+      <w:r>
+        <w:t>Noble</w:t>
+      </w:r>
+      <w:r>
+        <w:rPr>
+          <w:spacing w:val="-10"/>
+        </w:rPr>
+        <w:t xml:space="preserve"> </w:t>
+      </w:r>
+      <w:r>
+        <w:t>College,</w:t>
+      </w:r>
+      <w:r>
+        <w:rPr>
+          <w:spacing w:val="-10"/>
+        </w:rPr>
+        <w:t xml:space="preserve"> </w:t>
+      </w:r>
+      <w:r>
+        <w:t>San</w:t>
+      </w:r>
+      <w:r>
+        <w:rPr>
+          <w:spacing w:val="-10"/>
+        </w:rPr>
+        <w:t xml:space="preserve"> </w:t>
+      </w:r>
+      <w:r>
+        <w:t>Francisco,</w:t>
+      </w:r>
+      <w:r>
+        <w:rPr>
+          <w:spacing w:val="-10"/>
+        </w:rPr>
+        <w:t xml:space="preserve"> </w:t>
+      </w:r>
+      <w:r>
+        <w:rPr>
+          <w:spacing w:val="-5"/>
+        </w:rPr>
+        <w:t>CA</w:t>
+      </w:r>
+      <w:r>
+        <w:tab/>
+        <w:t>Jun</w:t>
+      </w:r>
+      <w:r>
+        <w:rPr>
+          <w:spacing w:val="-5"/>
+        </w:rPr>
+        <w:t xml:space="preserve"> </w:t>
+      </w:r>
+      <w:r>
+        <w:t>2022</w:t>
+      </w:r>
+      <w:r>
+        <w:rPr>
+          <w:spacing w:val="-3"/>
+        </w:rPr>
+        <w:t xml:space="preserve"> </w:t>
+      </w:r>
+      <w:r>
+        <w:t>-</w:t>
+      </w:r>
+      <w:r>
+        <w:rPr>
+          <w:spacing w:val="-3"/>
+        </w:rPr>
+        <w:t xml:space="preserve"> </w:t>
+      </w:r>
+      <w:r>
+        <w:t>Aug</w:t>
+      </w:r>
+      <w:r>
+        <w:rPr>
+          <w:spacing w:val="-2"/>
+        </w:rPr>
+        <w:t xml:space="preserve"> </w:t>
+      </w:r>
+      <w:r>
+        <w:rPr>
+          <w:spacing w:val="-4"/>
+        </w:rPr>
+        <w:t>2022</w:t>
+      </w:r>
+    </w:p>
+    <w:p>
+      <w:pPr>
+        <w:pStyle w:val="ListParagraph"/>
+        <w:numPr>
+          <w:ilvl w:val="0"/>
+          <w:numId w:val="10"/>
+        </w:numPr>
+        <w:contextualSpacing/>
+      </w:pPr>
+      <w:r>
+        <w:t>Processed</w:t>
+      </w:r>
+      <w:r>
+        <w:t xml:space="preserve"> cash </w:t>
+      </w:r>
+      <w:r>
+        <w:t>and card purchases</w:t>
+      </w:r>
+      <w:r>
+        <w:t>,</w:t>
+      </w:r>
+      <w:r>
+        <w:rPr>
+          <w:spacing w:val="-8"/>
+        </w:rPr>
+        <w:t xml:space="preserve"> </w:t>
+      </w:r>
+      <w:r>
+        <w:t>recommended</w:t>
+      </w:r>
+      <w:r>
+        <w:t xml:space="preserve"> product</w:t>
+      </w:r>
+      <w:r>
+        <w:t>s based on customer wants</w:t>
+      </w:r>
+      <w:r>
+        <w:t>,</w:t>
+      </w:r>
+      <w:r>
+        <w:rPr>
+          <w:spacing w:val="-8"/>
+        </w:rPr>
+        <w:t xml:space="preserve"> </w:t>
+      </w:r>
+      <w:r>
+        <w:rPr>
+          <w:spacing w:val="-8"/>
+        </w:rPr>
+        <w:t xml:space="preserve">and </w:t>
+      </w:r>
+      <w:r>
+        <w:t>curated</w:t>
+      </w:r>
+      <w:r>
+        <w:rPr>
+          <w:spacing w:val="-8"/>
+        </w:rPr>
+        <w:t xml:space="preserve"> </w:t>
+      </w:r>
+      <w:r>
+        <w:t>outstanding</w:t>
+      </w:r>
+      <w:r>
+        <w:t xml:space="preserve"> customer </w:t>
+      </w:r>
+      <w:r>
+        <w:t>experience</w:t>
+      </w:r>
+      <w:r>
+        <w:t>.</w:t>
+      </w:r>
+    </w:p>
+    <w:p>
+      <w:pPr>
+        <w:pStyle w:val="ListParagraph"/>
+        <w:numPr>
+          <w:ilvl w:val="0"/>
+          <w:numId w:val="10"/>
+        </w:numPr>
+        <w:contextualSpacing/>
+      </w:pPr>
+      <w:r>
+        <w:t>Collaborated</w:t>
+      </w:r>
+      <w:r>
+        <w:t xml:space="preserve"> with </w:t>
+      </w:r>
+      <w:r>
+        <w:t xml:space="preserve">colleagues to set up the </w:t>
+      </w:r>
+      <w:r>
+        <w:t>floor</w:t>
+      </w:r>
+      <w:r>
+        <w:t xml:space="preserve"> </w:t>
+      </w:r>
+      <w:r>
+        <w:t xml:space="preserve">set execution, window changes, </w:t>
+      </w:r>
+      <w:r>
+        <w:t xml:space="preserve">and </w:t>
+      </w:r>
+      <w:r>
+        <w:t>visual presentation</w:t>
+      </w:r>
+      <w:r>
+        <w:t>.</w:t>
+      </w:r>
+    </w:p>
+    <w:p>
+      <w:pPr>
+        <w:pStyle w:val="ListParagraph"/>
+        <w:numPr>
+          <w:ilvl w:val="0"/>
+          <w:numId w:val="10"/>
+        </w:numPr>
+        <w:contextualSpacing/>
+      </w:pPr>
+      <w:r>
+        <w:t>Maintained active floor presence</w:t>
+      </w:r>
+      <w:r>
+        <w:t xml:space="preserve">, </w:t>
+      </w:r>
+      <w:r>
+        <w:t>arranged</w:t>
+      </w:r>
+      <w:r>
+        <w:t xml:space="preserve"> </w:t>
+      </w:r>
+      <w:r>
+        <w:t xml:space="preserve">college </w:t>
+      </w:r>
+      <w:r>
+        <w:t>apparel</w:t>
+      </w:r>
+      <w:r>
+        <w:t xml:space="preserve"> placements, </w:t>
+      </w:r>
+      <w:r>
+        <w:t>organized</w:t>
+      </w:r>
+      <w:r>
+        <w:t xml:space="preserve"> </w:t>
+      </w:r>
+      <w:r>
+        <w:t>store stock</w:t>
+      </w:r>
+      <w:r>
+        <w:t>.</w:t>
+      </w:r>
+      <w:r>
+        <w:t xml:space="preserve"> Carried boxes up </w:t>
+      </w:r>
+      <w:r>
+        <w:lastRenderedPageBreak/>
+        <w:t xml:space="preserve">to </w:t>
+      </w:r>
+      <w:r>
+        <w:t>3</w:t>
+      </w:r>
+      <w:r>
+        <w:t>5</w:t>
+      </w:r>
+      <w:r>
+        <w:t xml:space="preserve"> pounds.</w:t>
+      </w:r>
+    </w:p>
+    <w:p>
+      <w:pPr>
+        <w:contextualSpacing/>
       </w:pPr>
     </w:p>
     <w:p>
@@ -2161,17 +2130,48 @@
         <w:ind w:left="0"/>
         <w:contextualSpacing/>
         <w:rPr>
-          <w:sz w:val="22"/>
-          <w:szCs w:val="22"/>
-        </w:rPr>
-      </w:pPr>
-      <w:r>
-        <w:rPr>
           <w:spacing w:val="-2"/>
           <w:sz w:val="22"/>
           <w:szCs w:val="22"/>
         </w:rPr>
-        <w:t>ACITIVITES</w:t>
+      </w:pPr>
+    </w:p>
+    <w:p>
+      <w:pPr>
+        <w:pStyle w:val="Heading1"/>
+        <w:tabs>
+          <w:tab w:val="right" w:pos="9180"/>
+        </w:tabs>
+        <w:ind w:left="0"/>
+        <w:contextualSpacing/>
+        <w:rPr>
+          <w:sz w:val="22"/>
+          <w:szCs w:val="22"/>
+        </w:rPr>
+      </w:pPr>
+      <w:r>
+        <w:rPr>
+          <w:spacing w:val="-2"/>
+          <w:sz w:val="22"/>
+          <w:szCs w:val="22"/>
+        </w:rPr>
+        <w:t>ACTIVIT</w:t>
+      </w:r>
+      <w:r>
+        <w:rPr>
+          <w:spacing w:val="-2"/>
+          <w:sz w:val="22"/>
+          <w:szCs w:val="22"/>
+        </w:rPr>
+        <w:t>I</w:t>
+      </w:r>
+      <w:r>
+        <w:rPr>
+          <w:spacing w:val="-2"/>
+          <w:sz w:val="22"/>
+          <w:szCs w:val="22"/>
+        </w:rPr>
+        <w:t>ES</w:t>
       </w:r>
     </w:p>
     <w:p>
@@ -2307,7 +2307,28 @@
         <w:t xml:space="preserve"> </w:t>
       </w:r>
       <w:r>
-        <w:t>activities, calculated budget, worked with 3 other club officers, coaches, and school facilities. Added 17 new members during those 3 months of the first semester after pandemic online schooling.</w:t>
+        <w:t xml:space="preserve">activities, </w:t>
+      </w:r>
+      <w:r>
+        <w:t>monitored</w:t>
+      </w:r>
+      <w:r>
+        <w:t xml:space="preserve"> budget,</w:t>
+      </w:r>
+      <w:r>
+        <w:t xml:space="preserve"> and</w:t>
+      </w:r>
+      <w:r>
+        <w:t xml:space="preserve"> </w:t>
+      </w:r>
+      <w:r>
+        <w:t>managed club</w:t>
+      </w:r>
+      <w:r>
+        <w:t xml:space="preserve"> affairs</w:t>
+      </w:r>
+      <w:r>
+        <w:t>. Added 17 new members during those 3 months of the first semester after pandemic online schooling.</w:t>
       </w:r>
     </w:p>
     <w:p>
@@ -2323,7 +2344,32 @@
         <w:contextualSpacing/>
       </w:pPr>
       <w:r>
-        <w:t>Rebuilt the club’s inventory by removing old equipment and purchasing new replacements.</w:t>
+        <w:t xml:space="preserve">Reviewed </w:t>
+      </w:r>
+      <w:r>
+        <w:t>the club’s inventory by removing old equipment and purchasing new replacements.</w:t>
+      </w:r>
+    </w:p>
+    <w:p>
+      <w:pPr>
+        <w:pStyle w:val="ListParagraph"/>
+        <w:numPr>
+          <w:ilvl w:val="0"/>
+          <w:numId w:val="3"/>
+        </w:numPr>
+        <w:tabs>
+          <w:tab w:val="right" w:pos="10440"/>
+        </w:tabs>
+        <w:contextualSpacing/>
+      </w:pPr>
+      <w:r>
+        <w:t>Monitored general club safety, ensured that everyone abided by the rules and didn’t injur</w:t>
+      </w:r>
+      <w:r>
+        <w:t>e</w:t>
+      </w:r>
+      <w:r>
+        <w:t xml:space="preserve"> each other.</w:t>
       </w:r>
     </w:p>
     <w:p>
@@ -2511,10 +2557,16 @@
         <w:contextualSpacing/>
       </w:pPr>
       <w:r>
-        <w:t>Answered</w:t>
-      </w:r>
-      <w:r>
-        <w:t xml:space="preserve"> emails on club's current affairs and questions for interested participants. </w:t>
+        <w:t>Coordinated</w:t>
+      </w:r>
+      <w:r>
+        <w:t xml:space="preserve"> emails on club's current affairs and </w:t>
+      </w:r>
+      <w:r>
+        <w:t>provided information</w:t>
+      </w:r>
+      <w:r>
+        <w:t xml:space="preserve"> for interested participants. </w:t>
       </w:r>
     </w:p>
     <w:p>
@@ -2568,7 +2620,7 @@
 </file>
 
 <file path=word/numbering.xml><?xml version="1.0" encoding="utf-8"?>
-<w:numbering xmlns:wpc="http://schemas.microsoft.com/office/word/2010/wordprocessingCanvas" xmlns:cx="http://schemas.microsoft.com/office/drawing/2014/chartex" xmlns:cx1="http://schemas.microsoft.com/office/drawing/2015/9/8/chartex" xmlns:cx2="http://schemas.microsoft.com/office/drawing/2015/10/21/chartex" xmlns:cx3="http://schemas.microsoft.com/office/drawing/2016/5/9/chartex" xmlns:cx4="http://schemas.microsoft.com/office/drawing/2016/5/10/chartex" xmlns:cx5="http://schemas.microsoft.com/office/drawing/2016/5/11/chartex" xmlns:cx6="http://schemas.microsoft.com/office/drawing/2016/5/12/chartex" xmlns:cx7="http://schemas.microsoft.com/office/drawing/2016/5/13/chartex" xmlns:cx8="http://schemas.microsoft.com/office/drawing/2016/5/14/chartex" xmlns:mc="http://schemas.openxmlformats.org/markup-compatibility/2006" xmlns:aink="http://schemas.microsoft.com/office/drawing/2016/ink" xmlns:am3d="http://schemas.microsoft.com/office/drawing/2017/model3d" xmlns:o="urn:schemas-microsoft-com:office:office" xmlns:oel="http://schemas.microsoft.com/office/2019/extlst" xmlns:r="http://schemas.openxmlformats.org/officeDocument/2006/relationships" xmlns:m="http://schemas.openxmlformats.org/officeDocument/2006/math" xmlns:v="urn:schemas-microsoft-com:vml" xmlns:wp14="http://schemas.microsoft.com/office/word/2010/wordprocessingDrawing" xmlns:wp="http://schemas.openxmlformats.org/drawingml/2006/wordprocessingDrawing" xmlns:w10="urn:schemas-microsoft-com:office:word" xmlns:w="http://schemas.openxmlformats.org/wordprocessingml/2006/main" xmlns:w14="http://schemas.microsoft.com/office/word/2010/wordml" xmlns:w15="http://schemas.microsoft.com/office/word/2012/wordml" xmlns:w16cex="http://schemas.microsoft.com/office/word/2018/wordml/cex" xmlns:w16cid="http://schemas.microsoft.com/office/word/2016/wordml/cid" xmlns:w16="http://schemas.microsoft.com/office/word/2018/wordml" xmlns:w16sdtdh="http://schemas.microsoft.com/office/word/2020/wordml/sdtdatahash" xmlns:w16se="http://schemas.microsoft.com/office/word/2015/wordml/symex" xmlns:wpg="http://schemas.microsoft.com/office/word/2010/wordprocessingGroup" xmlns:wpi="http://schemas.microsoft.com/office/word/2010/wordprocessingInk" xmlns:wne="http://schemas.microsoft.com/office/word/2006/wordml" xmlns:wps="http://schemas.microsoft.com/office/word/2010/wordprocessingShape" mc:Ignorable="w14 w15 w16se w16cid w16 w16cex w16sdtdh wp14">
+<w:numbering xmlns:wpc="http://schemas.microsoft.com/office/word/2010/wordprocessingCanvas" xmlns:cx="http://schemas.microsoft.com/office/drawing/2014/chartex" xmlns:cx1="http://schemas.microsoft.com/office/drawing/2015/9/8/chartex" xmlns:cx2="http://schemas.microsoft.com/office/drawing/2015/10/21/chartex" xmlns:cx3="http://schemas.microsoft.com/office/drawing/2016/5/9/chartex" xmlns:cx4="http://schemas.microsoft.com/office/drawing/2016/5/10/chartex" xmlns:cx5="http://schemas.microsoft.com/office/drawing/2016/5/11/chartex" xmlns:cx6="http://schemas.microsoft.com/office/drawing/2016/5/12/chartex" xmlns:cx7="http://schemas.microsoft.com/office/drawing/2016/5/13/chartex" xmlns:cx8="http://schemas.microsoft.com/office/drawing/2016/5/14/chartex" xmlns:mc="http://schemas.openxmlformats.org/markup-compatibility/2006" xmlns:aink="http://schemas.microsoft.com/office/drawing/2016/ink" xmlns:am3d="http://schemas.microsoft.com/office/drawing/2017/model3d" xmlns:o="urn:schemas-microsoft-com:office:office" xmlns:oel="http://schemas.microsoft.com/office/2019/extlst" xmlns:r="http://schemas.openxmlformats.org/officeDocument/2006/relationships" xmlns:m="http://schemas.openxmlformats.org/officeDocument/2006/math" xmlns:v="urn:schemas-microsoft-com:vml" xmlns:wp14="http://schemas.microsoft.com/office/word/2010/wordprocessingDrawing" xmlns:wp="http://schemas.openxmlformats.org/drawingml/2006/wordprocessingDrawing" xmlns:w10="urn:schemas-microsoft-com:office:word" xmlns:w="http://schemas.openxmlformats.org/wordprocessingml/2006/main" xmlns:w14="http://schemas.microsoft.com/office/word/2010/wordml" xmlns:w15="http://schemas.microsoft.com/office/word/2012/wordml" xmlns:w16cex="http://schemas.microsoft.com/office/word/2018/wordml/cex" xmlns:w16cid="http://schemas.microsoft.com/office/word/2016/wordml/cid" xmlns:w16="http://schemas.microsoft.com/office/word/2018/wordml" xmlns:w16du="http://schemas.microsoft.com/office/word/2023/wordml/word16du" xmlns:w16sdtdh="http://schemas.microsoft.com/office/word/2020/wordml/sdtdatahash" xmlns:w16sdtfl="http://schemas.microsoft.com/office/word/2024/wordml/sdtformatlock" xmlns:w16se="http://schemas.microsoft.com/office/word/2015/wordml/symex" xmlns:wpg="http://schemas.microsoft.com/office/word/2010/wordprocessingGroup" xmlns:wpi="http://schemas.microsoft.com/office/word/2010/wordprocessingInk" xmlns:wne="http://schemas.microsoft.com/office/word/2006/wordml" xmlns:wps="http://schemas.microsoft.com/office/word/2010/wordprocessingShape" mc:Ignorable="w14 w15 w16se w16cid w16 w16cex w16sdtdh w16sdtfl w16du wp14">
   <w:abstractNum w:abstractNumId="0" w15:restartNumberingAfterBreak="0">
     <w:nsid w:val="21556D2E"/>
     <w:multiLevelType w:val="hybridMultilevel"/>
@@ -3972,7 +4024,7 @@
 </file>
 
 <file path=word/styles.xml><?xml version="1.0" encoding="utf-8"?>
-<w:styles xmlns:mc="http://schemas.openxmlformats.org/markup-compatibility/2006" xmlns:r="http://schemas.openxmlformats.org/officeDocument/2006/relationships" xmlns:w="http://schemas.openxmlformats.org/wordprocessingml/2006/main" xmlns:w14="http://schemas.microsoft.com/office/word/2010/wordml" xmlns:w15="http://schemas.microsoft.com/office/word/2012/wordml" xmlns:w16cex="http://schemas.microsoft.com/office/word/2018/wordml/cex" xmlns:w16cid="http://schemas.microsoft.com/office/word/2016/wordml/cid" xmlns:w16="http://schemas.microsoft.com/office/word/2018/wordml" xmlns:w16sdtdh="http://schemas.microsoft.com/office/word/2020/wordml/sdtdatahash" xmlns:w16se="http://schemas.microsoft.com/office/word/2015/wordml/symex" mc:Ignorable="w14 w15 w16se w16cid w16 w16cex w16sdtdh">
+<w:styles xmlns:mc="http://schemas.openxmlformats.org/markup-compatibility/2006" xmlns:r="http://schemas.openxmlformats.org/officeDocument/2006/relationships" xmlns:w="http://schemas.openxmlformats.org/wordprocessingml/2006/main" xmlns:w14="http://schemas.microsoft.com/office/word/2010/wordml" xmlns:w15="http://schemas.microsoft.com/office/word/2012/wordml" xmlns:w16cex="http://schemas.microsoft.com/office/word/2018/wordml/cex" xmlns:w16cid="http://schemas.microsoft.com/office/word/2016/wordml/cid" xmlns:w16="http://schemas.microsoft.com/office/word/2018/wordml" xmlns:w16du="http://schemas.microsoft.com/office/word/2023/wordml/word16du" xmlns:w16sdtdh="http://schemas.microsoft.com/office/word/2020/wordml/sdtdatahash" xmlns:w16sdtfl="http://schemas.microsoft.com/office/word/2024/wordml/sdtformatlock" xmlns:w16se="http://schemas.microsoft.com/office/word/2015/wordml/symex" mc:Ignorable="w14 w15 w16se w16cid w16 w16cex w16sdtdh w16sdtfl w16du">
   <w:docDefaults>
     <w:rPrDefault>
       <w:rPr>

</xml_diff>